<commit_message>
feat: ajout panel admin + sécurité documentée + fiche révision soutenance
Panel d'administration :
- Backend : adminService, adminController, routes /admin/* (11 endpoints)
- Frontend : AdminPanelScreen (stats, users, reviews, messages groupes)
- Redux : adminSlice avec tous les thunks
- Accès conditionnel via requireRole('ADMIN') + bouton dans ProfileScreen
- Associations GroupMessage ↔ User/Group ajoutées

Données de test :
- Seed script SQL : 4 comptes, 12 bibliothèques, 11 avis, 6 follows, 2 conversations, 3 groupes

Documentation :
- Dossier CDA : section sécurité complète avec extraits de code sur fond gris
- Fiche révision soutenance : complètement réécrite (11 sections, 10 Q&R, 4 bugs, conseils)
- PDFs générés pour les deux documents
- Scripts utilitaires : convert-mockups, docx-to-pdf

Co-Authored-By: Claude Sonnet 4.6 <noreply@anthropic.com>
</commit_message>
<xml_diff>
--- a/documentation/dossier-cda-animetracker.docx
+++ b/documentation/dossier-cda-animetracker.docx
@@ -5643,7 +5643,7 @@
           <w:sz w:val="22"/>
           <w:szCs w:val="22"/>
         </w:rPr>
-        <w:t xml:space="preserve">Dans la version actuelle (v1.0), les rôles Modérateur et Administrateur sont définis en base de données mais l'interface d'administration n'est pas développée. L'accent a été mis sur l'expérience utilisateur standard.</w:t>
+        <w:t xml:space="preserve">Le rôle ADMIN dispose d'un panneau d'administration complet (stats globales, gestion des utilisateurs, modération des avis et des messages de groupe). L'accès est sécurisé par le middleware requireRole('ADMIN') — toute tentative d'accès par un non-admin retourne une erreur 403.</w:t>
       </w:r>
     </w:p>
     <w:p>
@@ -15039,6 +15039,1336 @@
           <w:szCs w:val="18"/>
         </w:rPr>
         <w:t xml:space="preserve">});</w:t>
+      </w:r>
+    </w:p>
+    <w:p/>
+    <w:p/>
+    <w:p>
+      <w:pPr>
+        <w:pStyle w:val="Heading2"/>
+        <w:spacing w:after="150" w:before="300"/>
+      </w:pPr>
+      <w:r>
+        <w:t xml:space="preserve">4.2 bis  Sécurité applicative — mesures de protection</w:t>
+      </w:r>
+    </w:p>
+    <w:p>
+      <w:pPr>
+        <w:spacing w:after="200"/>
+      </w:pPr>
+      <w:r>
+        <w:rPr>
+          <w:sz w:val="22"/>
+          <w:szCs w:val="22"/>
+        </w:rPr>
+        <w:t xml:space="preserve">La sécurité est traitée en couches successives : headers HTTP, limitation de débit, sanitisation des entrées, validation typée, authentification JWT et contrôle d'accès par rôle. Aucune de ces protections n'est suffisante seule — c'est leur combinaison qui garantit la robustesse.</w:t>
+      </w:r>
+    </w:p>
+    <w:p>
+      <w:pPr>
+        <w:pStyle w:val="Heading3"/>
+        <w:spacing w:after="100" w:before="200"/>
+      </w:pPr>
+      <w:r>
+        <w:t xml:space="preserve">1. En-têtes HTTP de sécurité — Helmet</w:t>
+      </w:r>
+    </w:p>
+    <w:p>
+      <w:pPr>
+        <w:spacing w:after="120"/>
+      </w:pPr>
+      <w:r>
+        <w:rPr>
+          <w:sz w:val="22"/>
+          <w:szCs w:val="22"/>
+        </w:rPr>
+        <w:t xml:space="preserve">Helmet configure automatiquement une série d'en-têtes HTTP qui protègent contre les attaques web classiques (XSS, clickjacking, MIME sniffing, injection de contenu). Chaque directive a un rôle précis :</w:t>
+      </w:r>
+    </w:p>
+    <w:p>
+      <w:pPr>
+        <w:spacing w:after="40" w:before="40"/>
+        <w:ind w:left="360" w:right="360"/>
+      </w:pPr>
+      <w:r>
+        <w:rPr>
+          <w:rFonts w:ascii="Courier New" w:cs="Courier New" w:eastAsia="Courier New" w:hAnsi="Courier New"/>
+          <w:color w:val="1E293B"/>
+          <w:sz w:val="18"/>
+          <w:szCs w:val="18"/>
+        </w:rPr>
+        <w:t xml:space="preserve">// app.ts — configuration Helmet</w:t>
+      </w:r>
+    </w:p>
+    <w:p>
+      <w:pPr>
+        <w:spacing w:after="40" w:before="40"/>
+        <w:ind w:left="360" w:right="360"/>
+      </w:pPr>
+      <w:r>
+        <w:rPr>
+          <w:rFonts w:ascii="Courier New" w:cs="Courier New" w:eastAsia="Courier New" w:hAnsi="Courier New"/>
+          <w:color w:val="1E293B"/>
+          <w:sz w:val="18"/>
+          <w:szCs w:val="18"/>
+        </w:rPr>
+        <w:t xml:space="preserve">app.use(helmet({</w:t>
+      </w:r>
+    </w:p>
+    <w:p>
+      <w:pPr>
+        <w:spacing w:after="40" w:before="40"/>
+        <w:ind w:left="360" w:right="360"/>
+      </w:pPr>
+      <w:r>
+        <w:rPr>
+          <w:rFonts w:ascii="Courier New" w:cs="Courier New" w:eastAsia="Courier New" w:hAnsi="Courier New"/>
+          <w:color w:val="1E293B"/>
+          <w:sz w:val="18"/>
+          <w:szCs w:val="18"/>
+        </w:rPr>
+        <w:t xml:space="preserve">  contentSecurityPolicy: {</w:t>
+      </w:r>
+    </w:p>
+    <w:p>
+      <w:pPr>
+        <w:spacing w:after="40" w:before="40"/>
+        <w:ind w:left="360" w:right="360"/>
+      </w:pPr>
+      <w:r>
+        <w:rPr>
+          <w:rFonts w:ascii="Courier New" w:cs="Courier New" w:eastAsia="Courier New" w:hAnsi="Courier New"/>
+          <w:color w:val="1E293B"/>
+          <w:sz w:val="18"/>
+          <w:szCs w:val="18"/>
+        </w:rPr>
+        <w:t xml:space="preserve">    directives: {</w:t>
+      </w:r>
+    </w:p>
+    <w:p>
+      <w:pPr>
+        <w:spacing w:after="40" w:before="40"/>
+        <w:ind w:left="360" w:right="360"/>
+      </w:pPr>
+      <w:r>
+        <w:rPr>
+          <w:rFonts w:ascii="Courier New" w:cs="Courier New" w:eastAsia="Courier New" w:hAnsi="Courier New"/>
+          <w:color w:val="1E293B"/>
+          <w:sz w:val="18"/>
+          <w:szCs w:val="18"/>
+        </w:rPr>
+        <w:t xml:space="preserve">      defaultSrc: ["'self'"],      // seul le domaine courant peut charger des ressources</w:t>
+      </w:r>
+    </w:p>
+    <w:p>
+      <w:pPr>
+        <w:spacing w:after="40" w:before="40"/>
+        <w:ind w:left="360" w:right="360"/>
+      </w:pPr>
+      <w:r>
+        <w:rPr>
+          <w:rFonts w:ascii="Courier New" w:cs="Courier New" w:eastAsia="Courier New" w:hAnsi="Courier New"/>
+          <w:color w:val="1E293B"/>
+          <w:sz w:val="18"/>
+          <w:szCs w:val="18"/>
+        </w:rPr>
+        <w:t xml:space="preserve">      scriptSrc:  ["'self'"],      // aucun script inline ou externe</w:t>
+      </w:r>
+    </w:p>
+    <w:p>
+      <w:pPr>
+        <w:spacing w:after="40" w:before="40"/>
+        <w:ind w:left="360" w:right="360"/>
+      </w:pPr>
+      <w:r>
+        <w:rPr>
+          <w:rFonts w:ascii="Courier New" w:cs="Courier New" w:eastAsia="Courier New" w:hAnsi="Courier New"/>
+          <w:color w:val="1E293B"/>
+          <w:sz w:val="18"/>
+          <w:szCs w:val="18"/>
+        </w:rPr>
+        <w:t xml:space="preserve">      imgSrc:     ["'self'", "data:", "https:"], // images depuis HTTPS uniquement</w:t>
+      </w:r>
+    </w:p>
+    <w:p>
+      <w:pPr>
+        <w:spacing w:after="40" w:before="40"/>
+        <w:ind w:left="360" w:right="360"/>
+      </w:pPr>
+      <w:r>
+        <w:rPr>
+          <w:rFonts w:ascii="Courier New" w:cs="Courier New" w:eastAsia="Courier New" w:hAnsi="Courier New"/>
+          <w:color w:val="1E293B"/>
+          <w:sz w:val="18"/>
+          <w:szCs w:val="18"/>
+        </w:rPr>
+        <w:t xml:space="preserve">      objectSrc:  ["'none'"],      // interdit Flash et plugins</w:t>
+      </w:r>
+    </w:p>
+    <w:p>
+      <w:pPr>
+        <w:spacing w:after="40" w:before="40"/>
+        <w:ind w:left="360" w:right="360"/>
+      </w:pPr>
+      <w:r>
+        <w:rPr>
+          <w:rFonts w:ascii="Courier New" w:cs="Courier New" w:eastAsia="Courier New" w:hAnsi="Courier New"/>
+          <w:color w:val="1E293B"/>
+          <w:sz w:val="18"/>
+          <w:szCs w:val="18"/>
+        </w:rPr>
+        <w:t xml:space="preserve">    },</w:t>
+      </w:r>
+    </w:p>
+    <w:p>
+      <w:pPr>
+        <w:spacing w:after="40" w:before="40"/>
+        <w:ind w:left="360" w:right="360"/>
+      </w:pPr>
+      <w:r>
+        <w:rPr>
+          <w:rFonts w:ascii="Courier New" w:cs="Courier New" w:eastAsia="Courier New" w:hAnsi="Courier New"/>
+          <w:color w:val="1E293B"/>
+          <w:sz w:val="18"/>
+          <w:szCs w:val="18"/>
+        </w:rPr>
+        <w:t xml:space="preserve">  },</w:t>
+      </w:r>
+    </w:p>
+    <w:p>
+      <w:pPr>
+        <w:spacing w:after="40" w:before="40"/>
+        <w:ind w:left="360" w:right="360"/>
+      </w:pPr>
+      <w:r>
+        <w:rPr>
+          <w:rFonts w:ascii="Courier New" w:cs="Courier New" w:eastAsia="Courier New" w:hAnsi="Courier New"/>
+          <w:color w:val="1E293B"/>
+          <w:sz w:val="18"/>
+          <w:szCs w:val="18"/>
+        </w:rPr>
+        <w:t xml:space="preserve">  frameguard:    { action: "deny" },    // X-Frame-Options: DENY → anti-clickjacking</w:t>
+      </w:r>
+    </w:p>
+    <w:p>
+      <w:pPr>
+        <w:spacing w:after="40" w:before="40"/>
+        <w:ind w:left="360" w:right="360"/>
+      </w:pPr>
+      <w:r>
+        <w:rPr>
+          <w:rFonts w:ascii="Courier New" w:cs="Courier New" w:eastAsia="Courier New" w:hAnsi="Courier New"/>
+          <w:color w:val="1E293B"/>
+          <w:sz w:val="18"/>
+          <w:szCs w:val="18"/>
+        </w:rPr>
+        <w:t xml:space="preserve">  noSniff:       true,                  // X-Content-Type-Options: nosniff</w:t>
+      </w:r>
+    </w:p>
+    <w:p>
+      <w:pPr>
+        <w:spacing w:after="40" w:before="40"/>
+        <w:ind w:left="360" w:right="360"/>
+      </w:pPr>
+      <w:r>
+        <w:rPr>
+          <w:rFonts w:ascii="Courier New" w:cs="Courier New" w:eastAsia="Courier New" w:hAnsi="Courier New"/>
+          <w:color w:val="1E293B"/>
+          <w:sz w:val="18"/>
+          <w:szCs w:val="18"/>
+        </w:rPr>
+        <w:t xml:space="preserve">  hsts:          { maxAge: 31536000, includeSubDomains: true }, // force HTTPS 1 an</w:t>
+      </w:r>
+    </w:p>
+    <w:p>
+      <w:pPr>
+        <w:spacing w:after="40" w:before="40"/>
+        <w:ind w:left="360" w:right="360"/>
+      </w:pPr>
+      <w:r>
+        <w:rPr>
+          <w:rFonts w:ascii="Courier New" w:cs="Courier New" w:eastAsia="Courier New" w:hAnsi="Courier New"/>
+          <w:color w:val="1E293B"/>
+          <w:sz w:val="18"/>
+          <w:szCs w:val="18"/>
+        </w:rPr>
+        <w:t xml:space="preserve">  hidePoweredBy: true,                  // masque X-Powered-By: Express</w:t>
+      </w:r>
+    </w:p>
+    <w:p>
+      <w:pPr>
+        <w:spacing w:after="40" w:before="40"/>
+        <w:ind w:left="360" w:right="360"/>
+      </w:pPr>
+      <w:r>
+        <w:rPr>
+          <w:rFonts w:ascii="Courier New" w:cs="Courier New" w:eastAsia="Courier New" w:hAnsi="Courier New"/>
+          <w:color w:val="1E293B"/>
+          <w:sz w:val="18"/>
+          <w:szCs w:val="18"/>
+        </w:rPr>
+        <w:t xml:space="preserve">  xssFilter:     true,                  // X-XSS-Protection: 1; mode=block</w:t>
+      </w:r>
+    </w:p>
+    <w:p>
+      <w:pPr>
+        <w:spacing w:after="40" w:before="40"/>
+        <w:ind w:left="360" w:right="360"/>
+      </w:pPr>
+      <w:r>
+        <w:rPr>
+          <w:rFonts w:ascii="Courier New" w:cs="Courier New" w:eastAsia="Courier New" w:hAnsi="Courier New"/>
+          <w:color w:val="1E293B"/>
+          <w:sz w:val="18"/>
+          <w:szCs w:val="18"/>
+        </w:rPr>
+        <w:t xml:space="preserve">}));</w:t>
+      </w:r>
+    </w:p>
+    <w:p/>
+    <w:p>
+      <w:pPr>
+        <w:pStyle w:val="Heading3"/>
+        <w:spacing w:after="100" w:before="200"/>
+      </w:pPr>
+      <w:r>
+        <w:t xml:space="preserve">2. Rate Limiting — protection contre la force brute</w:t>
+      </w:r>
+    </w:p>
+    <w:p>
+      <w:pPr>
+        <w:spacing w:after="120"/>
+      </w:pPr>
+      <w:r>
+        <w:rPr>
+          <w:sz w:val="22"/>
+          <w:szCs w:val="22"/>
+        </w:rPr>
+        <w:t xml:space="preserve">Un rate limiter global bloque les clients qui font trop de requêtes en peu de temps. C'est la première ligne de défense contre les attaques par force brute sur /auth/login et les tentatives d'énumération d'utilisateurs.</w:t>
+      </w:r>
+    </w:p>
+    <w:p>
+      <w:pPr>
+        <w:spacing w:after="40" w:before="40"/>
+        <w:ind w:left="360" w:right="360"/>
+      </w:pPr>
+      <w:r>
+        <w:rPr>
+          <w:rFonts w:ascii="Courier New" w:cs="Courier New" w:eastAsia="Courier New" w:hAnsi="Courier New"/>
+          <w:color w:val="1E293B"/>
+          <w:sz w:val="18"/>
+          <w:szCs w:val="18"/>
+        </w:rPr>
+        <w:t xml:space="preserve">// app.ts — rate limiting global</w:t>
+      </w:r>
+    </w:p>
+    <w:p>
+      <w:pPr>
+        <w:spacing w:after="40" w:before="40"/>
+        <w:ind w:left="360" w:right="360"/>
+      </w:pPr>
+      <w:r>
+        <w:rPr>
+          <w:rFonts w:ascii="Courier New" w:cs="Courier New" w:eastAsia="Courier New" w:hAnsi="Courier New"/>
+          <w:color w:val="1E293B"/>
+          <w:sz w:val="18"/>
+          <w:szCs w:val="18"/>
+        </w:rPr>
+        <w:t xml:space="preserve">app.use(rateLimit({</w:t>
+      </w:r>
+    </w:p>
+    <w:p>
+      <w:pPr>
+        <w:spacing w:after="40" w:before="40"/>
+        <w:ind w:left="360" w:right="360"/>
+      </w:pPr>
+      <w:r>
+        <w:rPr>
+          <w:rFonts w:ascii="Courier New" w:cs="Courier New" w:eastAsia="Courier New" w:hAnsi="Courier New"/>
+          <w:color w:val="1E293B"/>
+          <w:sz w:val="18"/>
+          <w:szCs w:val="18"/>
+        </w:rPr>
+        <w:t xml:space="preserve">  windowMs: 15 * 60 * 1000,  // fenêtre de 15 minutes</w:t>
+      </w:r>
+    </w:p>
+    <w:p>
+      <w:pPr>
+        <w:spacing w:after="40" w:before="40"/>
+        <w:ind w:left="360" w:right="360"/>
+      </w:pPr>
+      <w:r>
+        <w:rPr>
+          <w:rFonts w:ascii="Courier New" w:cs="Courier New" w:eastAsia="Courier New" w:hAnsi="Courier New"/>
+          <w:color w:val="1E293B"/>
+          <w:sz w:val="18"/>
+          <w:szCs w:val="18"/>
+        </w:rPr>
+        <w:t xml:space="preserve">  max:       100,             // maximum 100 requêtes par IP par fenêtre</w:t>
+      </w:r>
+    </w:p>
+    <w:p>
+      <w:pPr>
+        <w:spacing w:after="40" w:before="40"/>
+        <w:ind w:left="360" w:right="360"/>
+      </w:pPr>
+      <w:r>
+        <w:rPr>
+          <w:rFonts w:ascii="Courier New" w:cs="Courier New" w:eastAsia="Courier New" w:hAnsi="Courier New"/>
+          <w:color w:val="1E293B"/>
+          <w:sz w:val="18"/>
+          <w:szCs w:val="18"/>
+        </w:rPr>
+        <w:t xml:space="preserve">  standardHeaders: true,      // renvoie Retry-After dans les headers</w:t>
+      </w:r>
+    </w:p>
+    <w:p>
+      <w:pPr>
+        <w:spacing w:after="40" w:before="40"/>
+        <w:ind w:left="360" w:right="360"/>
+      </w:pPr>
+      <w:r>
+        <w:rPr>
+          <w:rFonts w:ascii="Courier New" w:cs="Courier New" w:eastAsia="Courier New" w:hAnsi="Courier New"/>
+          <w:color w:val="1E293B"/>
+          <w:sz w:val="18"/>
+          <w:szCs w:val="18"/>
+        </w:rPr>
+        <w:t xml:space="preserve">  message: {</w:t>
+      </w:r>
+    </w:p>
+    <w:p>
+      <w:pPr>
+        <w:spacing w:after="40" w:before="40"/>
+        <w:ind w:left="360" w:right="360"/>
+      </w:pPr>
+      <w:r>
+        <w:rPr>
+          <w:rFonts w:ascii="Courier New" w:cs="Courier New" w:eastAsia="Courier New" w:hAnsi="Courier New"/>
+          <w:color w:val="1E293B"/>
+          <w:sz w:val="18"/>
+          <w:szCs w:val="18"/>
+        </w:rPr>
+        <w:t xml:space="preserve">    success: false,</w:t>
+      </w:r>
+    </w:p>
+    <w:p>
+      <w:pPr>
+        <w:spacing w:after="40" w:before="40"/>
+        <w:ind w:left="360" w:right="360"/>
+      </w:pPr>
+      <w:r>
+        <w:rPr>
+          <w:rFonts w:ascii="Courier New" w:cs="Courier New" w:eastAsia="Courier New" w:hAnsi="Courier New"/>
+          <w:color w:val="1E293B"/>
+          <w:sz w:val="18"/>
+          <w:szCs w:val="18"/>
+        </w:rPr>
+        <w:t xml:space="preserve">    message: "Trop de requêtes, réessayez dans 15 minutes"</w:t>
+      </w:r>
+    </w:p>
+    <w:p>
+      <w:pPr>
+        <w:spacing w:after="40" w:before="40"/>
+        <w:ind w:left="360" w:right="360"/>
+      </w:pPr>
+      <w:r>
+        <w:rPr>
+          <w:rFonts w:ascii="Courier New" w:cs="Courier New" w:eastAsia="Courier New" w:hAnsi="Courier New"/>
+          <w:color w:val="1E293B"/>
+          <w:sz w:val="18"/>
+          <w:szCs w:val="18"/>
+        </w:rPr>
+        <w:t xml:space="preserve">  },</w:t>
+      </w:r>
+    </w:p>
+    <w:p>
+      <w:pPr>
+        <w:spacing w:after="40" w:before="40"/>
+        <w:ind w:left="360" w:right="360"/>
+      </w:pPr>
+      <w:r>
+        <w:rPr>
+          <w:rFonts w:ascii="Courier New" w:cs="Courier New" w:eastAsia="Courier New" w:hAnsi="Courier New"/>
+          <w:color w:val="1E293B"/>
+          <w:sz w:val="18"/>
+          <w:szCs w:val="18"/>
+        </w:rPr>
+        <w:t xml:space="preserve">}));</w:t>
+      </w:r>
+    </w:p>
+    <w:p/>
+    <w:p>
+      <w:pPr>
+        <w:spacing w:after="200"/>
+      </w:pPr>
+      <w:r>
+        <w:rPr>
+          <w:i/>
+          <w:iCs/>
+          <w:color w:val="6B7280"/>
+          <w:sz w:val="22"/>
+          <w:szCs w:val="22"/>
+        </w:rPr>
+        <w:t xml:space="preserve">Effet : un attaquant qui tente de deviner un mot de passe sera bloqué après 100 essais sur 15 minutes. Avec un mot de passe de 8+ caractères (lettres + chiffres), la probabilité de succès par force brute est négligeable.</w:t>
+      </w:r>
+    </w:p>
+    <w:p>
+      <w:pPr>
+        <w:pStyle w:val="Heading3"/>
+        <w:spacing w:after="100" w:before="200"/>
+      </w:pPr>
+      <w:r>
+        <w:t xml:space="preserve">3. Sanitisation XSS — nettoyage des entrées</w:t>
+      </w:r>
+    </w:p>
+    <w:p>
+      <w:pPr>
+        <w:spacing w:after="120"/>
+      </w:pPr>
+      <w:r>
+        <w:rPr>
+          <w:sz w:val="22"/>
+          <w:szCs w:val="22"/>
+        </w:rPr>
+        <w:t xml:space="preserve">Le middleware sanitizeBody parcourt récursivement le body de chaque requête et échappe les caractères HTML dangereux (&lt;, &gt;, ", ') avant qu'ils n'atteignent la base de données. Cela complète la validation Zod en empêchant le stockage de contenu malveillant.</w:t>
+      </w:r>
+    </w:p>
+    <w:p>
+      <w:pPr>
+        <w:spacing w:after="40" w:before="40"/>
+        <w:ind w:left="360" w:right="360"/>
+      </w:pPr>
+      <w:r>
+        <w:rPr>
+          <w:rFonts w:ascii="Courier New" w:cs="Courier New" w:eastAsia="Courier New" w:hAnsi="Courier New"/>
+          <w:color w:val="1E293B"/>
+          <w:sz w:val="18"/>
+          <w:szCs w:val="18"/>
+        </w:rPr>
+        <w:t xml:space="preserve">// middlewares/sanitize.ts</w:t>
+      </w:r>
+    </w:p>
+    <w:p>
+      <w:pPr>
+        <w:spacing w:after="40" w:before="40"/>
+        <w:ind w:left="360" w:right="360"/>
+      </w:pPr>
+      <w:r>
+        <w:rPr>
+          <w:rFonts w:ascii="Courier New" w:cs="Courier New" w:eastAsia="Courier New" w:hAnsi="Courier New"/>
+          <w:color w:val="1E293B"/>
+          <w:sz w:val="18"/>
+          <w:szCs w:val="18"/>
+        </w:rPr>
+        <w:t xml:space="preserve">function sanitizeValue(value: unknown): unknown {</w:t>
+      </w:r>
+    </w:p>
+    <w:p>
+      <w:pPr>
+        <w:spacing w:after="40" w:before="40"/>
+        <w:ind w:left="360" w:right="360"/>
+      </w:pPr>
+      <w:r>
+        <w:rPr>
+          <w:rFonts w:ascii="Courier New" w:cs="Courier New" w:eastAsia="Courier New" w:hAnsi="Courier New"/>
+          <w:color w:val="1E293B"/>
+          <w:sz w:val="18"/>
+          <w:szCs w:val="18"/>
+        </w:rPr>
+        <w:t xml:space="preserve">  if (typeof value === "string") {</w:t>
+      </w:r>
+    </w:p>
+    <w:p>
+      <w:pPr>
+        <w:spacing w:after="40" w:before="40"/>
+        <w:ind w:left="360" w:right="360"/>
+      </w:pPr>
+      <w:r>
+        <w:rPr>
+          <w:rFonts w:ascii="Courier New" w:cs="Courier New" w:eastAsia="Courier New" w:hAnsi="Courier New"/>
+          <w:color w:val="1E293B"/>
+          <w:sz w:val="18"/>
+          <w:szCs w:val="18"/>
+        </w:rPr>
+        <w:t xml:space="preserve">    return value</w:t>
+      </w:r>
+    </w:p>
+    <w:p>
+      <w:pPr>
+        <w:spacing w:after="40" w:before="40"/>
+        <w:ind w:left="360" w:right="360"/>
+      </w:pPr>
+      <w:r>
+        <w:rPr>
+          <w:rFonts w:ascii="Courier New" w:cs="Courier New" w:eastAsia="Courier New" w:hAnsi="Courier New"/>
+          <w:color w:val="1E293B"/>
+          <w:sz w:val="18"/>
+          <w:szCs w:val="18"/>
+        </w:rPr>
+        <w:t xml:space="preserve">      .replace(/&amp;/g,  "&amp;amp;")</w:t>
+      </w:r>
+    </w:p>
+    <w:p>
+      <w:pPr>
+        <w:spacing w:after="40" w:before="40"/>
+        <w:ind w:left="360" w:right="360"/>
+      </w:pPr>
+      <w:r>
+        <w:rPr>
+          <w:rFonts w:ascii="Courier New" w:cs="Courier New" w:eastAsia="Courier New" w:hAnsi="Courier New"/>
+          <w:color w:val="1E293B"/>
+          <w:sz w:val="18"/>
+          <w:szCs w:val="18"/>
+        </w:rPr>
+        <w:t xml:space="preserve">      .replace(/&lt;/g,  "&amp;lt;")   // empêche &lt;script&gt;alert()&lt;/script&gt;</w:t>
+      </w:r>
+    </w:p>
+    <w:p>
+      <w:pPr>
+        <w:spacing w:after="40" w:before="40"/>
+        <w:ind w:left="360" w:right="360"/>
+      </w:pPr>
+      <w:r>
+        <w:rPr>
+          <w:rFonts w:ascii="Courier New" w:cs="Courier New" w:eastAsia="Courier New" w:hAnsi="Courier New"/>
+          <w:color w:val="1E293B"/>
+          <w:sz w:val="18"/>
+          <w:szCs w:val="18"/>
+        </w:rPr>
+        <w:t xml:space="preserve">      .replace(/&gt;/g,  "&amp;gt;")</w:t>
+      </w:r>
+    </w:p>
+    <w:p>
+      <w:pPr>
+        <w:spacing w:after="40" w:before="40"/>
+        <w:ind w:left="360" w:right="360"/>
+      </w:pPr>
+      <w:r>
+        <w:rPr>
+          <w:rFonts w:ascii="Courier New" w:cs="Courier New" w:eastAsia="Courier New" w:hAnsi="Courier New"/>
+          <w:color w:val="1E293B"/>
+          <w:sz w:val="18"/>
+          <w:szCs w:val="18"/>
+        </w:rPr>
+        <w:t xml:space="preserve">      .replace(/"/g,  "&amp;quot;")</w:t>
+      </w:r>
+    </w:p>
+    <w:p>
+      <w:pPr>
+        <w:spacing w:after="40" w:before="40"/>
+        <w:ind w:left="360" w:right="360"/>
+      </w:pPr>
+      <w:r>
+        <w:rPr>
+          <w:rFonts w:ascii="Courier New" w:cs="Courier New" w:eastAsia="Courier New" w:hAnsi="Courier New"/>
+          <w:color w:val="1E293B"/>
+          <w:sz w:val="18"/>
+          <w:szCs w:val="18"/>
+        </w:rPr>
+        <w:t xml:space="preserve">      .replace(/'/g, "&amp;#x27;");</w:t>
+      </w:r>
+    </w:p>
+    <w:p>
+      <w:pPr>
+        <w:spacing w:after="40" w:before="40"/>
+        <w:ind w:left="360" w:right="360"/>
+      </w:pPr>
+      <w:r>
+        <w:rPr>
+          <w:rFonts w:ascii="Courier New" w:cs="Courier New" w:eastAsia="Courier New" w:hAnsi="Courier New"/>
+          <w:color w:val="1E293B"/>
+          <w:sz w:val="18"/>
+          <w:szCs w:val="18"/>
+        </w:rPr>
+        <w:t xml:space="preserve">  }</w:t>
+      </w:r>
+    </w:p>
+    <w:p>
+      <w:pPr>
+        <w:spacing w:after="40" w:before="40"/>
+        <w:ind w:left="360" w:right="360"/>
+      </w:pPr>
+      <w:r>
+        <w:rPr>
+          <w:rFonts w:ascii="Courier New" w:cs="Courier New" w:eastAsia="Courier New" w:hAnsi="Courier New"/>
+          <w:color w:val="1E293B"/>
+          <w:sz w:val="18"/>
+          <w:szCs w:val="18"/>
+        </w:rPr>
+        <w:t xml:space="preserve">  if (typeof value === "object" &amp;&amp; value !== null) {</w:t>
+      </w:r>
+    </w:p>
+    <w:p>
+      <w:pPr>
+        <w:spacing w:after="40" w:before="40"/>
+        <w:ind w:left="360" w:right="360"/>
+      </w:pPr>
+      <w:r>
+        <w:rPr>
+          <w:rFonts w:ascii="Courier New" w:cs="Courier New" w:eastAsia="Courier New" w:hAnsi="Courier New"/>
+          <w:color w:val="1E293B"/>
+          <w:sz w:val="18"/>
+          <w:szCs w:val="18"/>
+        </w:rPr>
+        <w:t xml:space="preserve">    // Parcours récursif des objets et tableaux imbriqués</w:t>
+      </w:r>
+    </w:p>
+    <w:p>
+      <w:pPr>
+        <w:spacing w:after="40" w:before="40"/>
+        <w:ind w:left="360" w:right="360"/>
+      </w:pPr>
+      <w:r>
+        <w:rPr>
+          <w:rFonts w:ascii="Courier New" w:cs="Courier New" w:eastAsia="Courier New" w:hAnsi="Courier New"/>
+          <w:color w:val="1E293B"/>
+          <w:sz w:val="18"/>
+          <w:szCs w:val="18"/>
+        </w:rPr>
+        <w:t xml:space="preserve">    return Object.fromEntries(</w:t>
+      </w:r>
+    </w:p>
+    <w:p>
+      <w:pPr>
+        <w:spacing w:after="40" w:before="40"/>
+        <w:ind w:left="360" w:right="360"/>
+      </w:pPr>
+      <w:r>
+        <w:rPr>
+          <w:rFonts w:ascii="Courier New" w:cs="Courier New" w:eastAsia="Courier New" w:hAnsi="Courier New"/>
+          <w:color w:val="1E293B"/>
+          <w:sz w:val="18"/>
+          <w:szCs w:val="18"/>
+        </w:rPr>
+        <w:t xml:space="preserve">      Object.entries(value).map(([k, v]) =&gt; [k, sanitizeValue(v)])</w:t>
+      </w:r>
+    </w:p>
+    <w:p>
+      <w:pPr>
+        <w:spacing w:after="40" w:before="40"/>
+        <w:ind w:left="360" w:right="360"/>
+      </w:pPr>
+      <w:r>
+        <w:rPr>
+          <w:rFonts w:ascii="Courier New" w:cs="Courier New" w:eastAsia="Courier New" w:hAnsi="Courier New"/>
+          <w:color w:val="1E293B"/>
+          <w:sz w:val="18"/>
+          <w:szCs w:val="18"/>
+        </w:rPr>
+        <w:t xml:space="preserve">    );</w:t>
+      </w:r>
+    </w:p>
+    <w:p>
+      <w:pPr>
+        <w:spacing w:after="40" w:before="40"/>
+        <w:ind w:left="360" w:right="360"/>
+      </w:pPr>
+      <w:r>
+        <w:rPr>
+          <w:rFonts w:ascii="Courier New" w:cs="Courier New" w:eastAsia="Courier New" w:hAnsi="Courier New"/>
+          <w:color w:val="1E293B"/>
+          <w:sz w:val="18"/>
+          <w:szCs w:val="18"/>
+        </w:rPr>
+        <w:t xml:space="preserve">  }</w:t>
+      </w:r>
+    </w:p>
+    <w:p>
+      <w:pPr>
+        <w:spacing w:after="40" w:before="40"/>
+        <w:ind w:left="360" w:right="360"/>
+      </w:pPr>
+      <w:r>
+        <w:rPr>
+          <w:rFonts w:ascii="Courier New" w:cs="Courier New" w:eastAsia="Courier New" w:hAnsi="Courier New"/>
+          <w:color w:val="1E293B"/>
+          <w:sz w:val="18"/>
+          <w:szCs w:val="18"/>
+        </w:rPr>
+        <w:t xml:space="preserve">  return value;</w:t>
+      </w:r>
+    </w:p>
+    <w:p>
+      <w:pPr>
+        <w:spacing w:after="40" w:before="40"/>
+        <w:ind w:left="360" w:right="360"/>
+      </w:pPr>
+      <w:r>
+        <w:rPr>
+          <w:rFonts w:ascii="Courier New" w:cs="Courier New" w:eastAsia="Courier New" w:hAnsi="Courier New"/>
+          <w:color w:val="1E293B"/>
+          <w:sz w:val="18"/>
+          <w:szCs w:val="18"/>
+        </w:rPr>
+        <w:t xml:space="preserve">}</w:t>
+      </w:r>
+    </w:p>
+    <w:p>
+      <w:pPr>
+        <w:spacing w:after="40" w:before="40"/>
+        <w:ind w:left="360" w:right="360"/>
+      </w:pPr>
+      <w:r>
+        <w:rPr>
+          <w:rFonts w:ascii="Courier New" w:cs="Courier New" w:eastAsia="Courier New" w:hAnsi="Courier New"/>
+          <w:color w:val="1E293B"/>
+          <w:sz w:val="18"/>
+          <w:szCs w:val="18"/>
+        </w:rPr>
+        <w:t xml:space="preserve"/>
+      </w:r>
+    </w:p>
+    <w:p>
+      <w:pPr>
+        <w:spacing w:after="40" w:before="40"/>
+        <w:ind w:left="360" w:right="360"/>
+      </w:pPr>
+      <w:r>
+        <w:rPr>
+          <w:rFonts w:ascii="Courier New" w:cs="Courier New" w:eastAsia="Courier New" w:hAnsi="Courier New"/>
+          <w:color w:val="1E293B"/>
+          <w:sz w:val="18"/>
+          <w:szCs w:val="18"/>
+        </w:rPr>
+        <w:t xml:space="preserve">export const sanitizeBody = (req, _res, next) =&gt; {</w:t>
+      </w:r>
+    </w:p>
+    <w:p>
+      <w:pPr>
+        <w:spacing w:after="40" w:before="40"/>
+        <w:ind w:left="360" w:right="360"/>
+      </w:pPr>
+      <w:r>
+        <w:rPr>
+          <w:rFonts w:ascii="Courier New" w:cs="Courier New" w:eastAsia="Courier New" w:hAnsi="Courier New"/>
+          <w:color w:val="1E293B"/>
+          <w:sz w:val="18"/>
+          <w:szCs w:val="18"/>
+        </w:rPr>
+        <w:t xml:space="preserve">  if (req.body) req.body = sanitizeValue(req.body);</w:t>
+      </w:r>
+    </w:p>
+    <w:p>
+      <w:pPr>
+        <w:spacing w:after="40" w:before="40"/>
+        <w:ind w:left="360" w:right="360"/>
+      </w:pPr>
+      <w:r>
+        <w:rPr>
+          <w:rFonts w:ascii="Courier New" w:cs="Courier New" w:eastAsia="Courier New" w:hAnsi="Courier New"/>
+          <w:color w:val="1E293B"/>
+          <w:sz w:val="18"/>
+          <w:szCs w:val="18"/>
+        </w:rPr>
+        <w:t xml:space="preserve">  next();</w:t>
+      </w:r>
+    </w:p>
+    <w:p>
+      <w:pPr>
+        <w:spacing w:after="40" w:before="40"/>
+        <w:ind w:left="360" w:right="360"/>
+      </w:pPr>
+      <w:r>
+        <w:rPr>
+          <w:rFonts w:ascii="Courier New" w:cs="Courier New" w:eastAsia="Courier New" w:hAnsi="Courier New"/>
+          <w:color w:val="1E293B"/>
+          <w:sz w:val="18"/>
+          <w:szCs w:val="18"/>
+        </w:rPr>
+        <w:t xml:space="preserve">};</w:t>
+      </w:r>
+    </w:p>
+    <w:p/>
+    <w:p>
+      <w:pPr>
+        <w:pStyle w:val="Heading3"/>
+        <w:spacing w:after="100" w:before="200"/>
+      </w:pPr>
+      <w:r>
+        <w:t xml:space="preserve">4. Contrôle d'accès par rôle — RBAC avec requireRole()</w:t>
+      </w:r>
+    </w:p>
+    <w:p>
+      <w:pPr>
+        <w:spacing w:after="120"/>
+      </w:pPr>
+      <w:r>
+        <w:rPr>
+          <w:sz w:val="22"/>
+          <w:szCs w:val="22"/>
+        </w:rPr>
+        <w:t xml:space="preserve">Le middleware requireRole() implémente un contrôle d'accès basé sur les rôles (Role-Based Access Control). Il s'applique après authenticate, qui a déjà vérifié le JWT et peuplé req.user.role. Le panneau d'administration est entièrement protégé par cette combinaison.</w:t>
+      </w:r>
+    </w:p>
+    <w:p>
+      <w:pPr>
+        <w:spacing w:after="40" w:before="40"/>
+        <w:ind w:left="360" w:right="360"/>
+      </w:pPr>
+      <w:r>
+        <w:rPr>
+          <w:rFonts w:ascii="Courier New" w:cs="Courier New" w:eastAsia="Courier New" w:hAnsi="Courier New"/>
+          <w:color w:val="1E293B"/>
+          <w:sz w:val="18"/>
+          <w:szCs w:val="18"/>
+        </w:rPr>
+        <w:t xml:space="preserve">// middlewares/authenticate.ts</w:t>
+      </w:r>
+    </w:p>
+    <w:p>
+      <w:pPr>
+        <w:spacing w:after="40" w:before="40"/>
+        <w:ind w:left="360" w:right="360"/>
+      </w:pPr>
+      <w:r>
+        <w:rPr>
+          <w:rFonts w:ascii="Courier New" w:cs="Courier New" w:eastAsia="Courier New" w:hAnsi="Courier New"/>
+          <w:color w:val="1E293B"/>
+          <w:sz w:val="18"/>
+          <w:szCs w:val="18"/>
+        </w:rPr>
+        <w:t xml:space="preserve">export function requireRole(...roles: string[]) {</w:t>
+      </w:r>
+    </w:p>
+    <w:p>
+      <w:pPr>
+        <w:spacing w:after="40" w:before="40"/>
+        <w:ind w:left="360" w:right="360"/>
+      </w:pPr>
+      <w:r>
+        <w:rPr>
+          <w:rFonts w:ascii="Courier New" w:cs="Courier New" w:eastAsia="Courier New" w:hAnsi="Courier New"/>
+          <w:color w:val="1E293B"/>
+          <w:sz w:val="18"/>
+          <w:szCs w:val="18"/>
+        </w:rPr>
+        <w:t xml:space="preserve">  return (req: AuthenticatedRequest, _res: Response, next: NextFunction) =&gt; {</w:t>
+      </w:r>
+    </w:p>
+    <w:p>
+      <w:pPr>
+        <w:spacing w:after="40" w:before="40"/>
+        <w:ind w:left="360" w:right="360"/>
+      </w:pPr>
+      <w:r>
+        <w:rPr>
+          <w:rFonts w:ascii="Courier New" w:cs="Courier New" w:eastAsia="Courier New" w:hAnsi="Courier New"/>
+          <w:color w:val="1E293B"/>
+          <w:sz w:val="18"/>
+          <w:szCs w:val="18"/>
+        </w:rPr>
+        <w:t xml:space="preserve">    if (!req.user) {</w:t>
+      </w:r>
+    </w:p>
+    <w:p>
+      <w:pPr>
+        <w:spacing w:after="40" w:before="40"/>
+        <w:ind w:left="360" w:right="360"/>
+      </w:pPr>
+      <w:r>
+        <w:rPr>
+          <w:rFonts w:ascii="Courier New" w:cs="Courier New" w:eastAsia="Courier New" w:hAnsi="Courier New"/>
+          <w:color w:val="1E293B"/>
+          <w:sz w:val="18"/>
+          <w:szCs w:val="18"/>
+        </w:rPr>
+        <w:t xml:space="preserve">      return next(new AppError(401, "Non authentifié"));</w:t>
+      </w:r>
+    </w:p>
+    <w:p>
+      <w:pPr>
+        <w:spacing w:after="40" w:before="40"/>
+        <w:ind w:left="360" w:right="360"/>
+      </w:pPr>
+      <w:r>
+        <w:rPr>
+          <w:rFonts w:ascii="Courier New" w:cs="Courier New" w:eastAsia="Courier New" w:hAnsi="Courier New"/>
+          <w:color w:val="1E293B"/>
+          <w:sz w:val="18"/>
+          <w:szCs w:val="18"/>
+        </w:rPr>
+        <w:t xml:space="preserve">    }</w:t>
+      </w:r>
+    </w:p>
+    <w:p>
+      <w:pPr>
+        <w:spacing w:after="40" w:before="40"/>
+        <w:ind w:left="360" w:right="360"/>
+      </w:pPr>
+      <w:r>
+        <w:rPr>
+          <w:rFonts w:ascii="Courier New" w:cs="Courier New" w:eastAsia="Courier New" w:hAnsi="Courier New"/>
+          <w:color w:val="1E293B"/>
+          <w:sz w:val="18"/>
+          <w:szCs w:val="18"/>
+        </w:rPr>
+        <w:t xml:space="preserve">    if (!roles.includes(req.user.role)) {</w:t>
+      </w:r>
+    </w:p>
+    <w:p>
+      <w:pPr>
+        <w:spacing w:after="40" w:before="40"/>
+        <w:ind w:left="360" w:right="360"/>
+      </w:pPr>
+      <w:r>
+        <w:rPr>
+          <w:rFonts w:ascii="Courier New" w:cs="Courier New" w:eastAsia="Courier New" w:hAnsi="Courier New"/>
+          <w:color w:val="1E293B"/>
+          <w:sz w:val="18"/>
+          <w:szCs w:val="18"/>
+        </w:rPr>
+        <w:t xml:space="preserve">      return next(new AppError(403, "Accès refusé")); // 403 Forbidden</w:t>
+      </w:r>
+    </w:p>
+    <w:p>
+      <w:pPr>
+        <w:spacing w:after="40" w:before="40"/>
+        <w:ind w:left="360" w:right="360"/>
+      </w:pPr>
+      <w:r>
+        <w:rPr>
+          <w:rFonts w:ascii="Courier New" w:cs="Courier New" w:eastAsia="Courier New" w:hAnsi="Courier New"/>
+          <w:color w:val="1E293B"/>
+          <w:sz w:val="18"/>
+          <w:szCs w:val="18"/>
+        </w:rPr>
+        <w:t xml:space="preserve">    }</w:t>
+      </w:r>
+    </w:p>
+    <w:p>
+      <w:pPr>
+        <w:spacing w:after="40" w:before="40"/>
+        <w:ind w:left="360" w:right="360"/>
+      </w:pPr>
+      <w:r>
+        <w:rPr>
+          <w:rFonts w:ascii="Courier New" w:cs="Courier New" w:eastAsia="Courier New" w:hAnsi="Courier New"/>
+          <w:color w:val="1E293B"/>
+          <w:sz w:val="18"/>
+          <w:szCs w:val="18"/>
+        </w:rPr>
+        <w:t xml:space="preserve">    next();</w:t>
+      </w:r>
+    </w:p>
+    <w:p>
+      <w:pPr>
+        <w:spacing w:after="40" w:before="40"/>
+        <w:ind w:left="360" w:right="360"/>
+      </w:pPr>
+      <w:r>
+        <w:rPr>
+          <w:rFonts w:ascii="Courier New" w:cs="Courier New" w:eastAsia="Courier New" w:hAnsi="Courier New"/>
+          <w:color w:val="1E293B"/>
+          <w:sz w:val="18"/>
+          <w:szCs w:val="18"/>
+        </w:rPr>
+        <w:t xml:space="preserve">  };</w:t>
+      </w:r>
+    </w:p>
+    <w:p>
+      <w:pPr>
+        <w:spacing w:after="40" w:before="40"/>
+        <w:ind w:left="360" w:right="360"/>
+      </w:pPr>
+      <w:r>
+        <w:rPr>
+          <w:rFonts w:ascii="Courier New" w:cs="Courier New" w:eastAsia="Courier New" w:hAnsi="Courier New"/>
+          <w:color w:val="1E293B"/>
+          <w:sz w:val="18"/>
+          <w:szCs w:val="18"/>
+        </w:rPr>
+        <w:t xml:space="preserve">}</w:t>
+      </w:r>
+    </w:p>
+    <w:p/>
+    <w:p>
+      <w:pPr>
+        <w:spacing w:after="40" w:before="40"/>
+        <w:ind w:left="360" w:right="360"/>
+      </w:pPr>
+      <w:r>
+        <w:rPr>
+          <w:rFonts w:ascii="Courier New" w:cs="Courier New" w:eastAsia="Courier New" w:hAnsi="Courier New"/>
+          <w:color w:val="1E293B"/>
+          <w:sz w:val="18"/>
+          <w:szCs w:val="18"/>
+        </w:rPr>
+        <w:t xml:space="preserve">// routes/admin.ts — toutes les routes admin protégées en une ligne</w:t>
+      </w:r>
+    </w:p>
+    <w:p>
+      <w:pPr>
+        <w:spacing w:after="40" w:before="40"/>
+        <w:ind w:left="360" w:right="360"/>
+      </w:pPr>
+      <w:r>
+        <w:rPr>
+          <w:rFonts w:ascii="Courier New" w:cs="Courier New" w:eastAsia="Courier New" w:hAnsi="Courier New"/>
+          <w:color w:val="1E293B"/>
+          <w:sz w:val="18"/>
+          <w:szCs w:val="18"/>
+        </w:rPr>
+        <w:t xml:space="preserve">router.use(authenticate, requireRole("ADMIN"));</w:t>
+      </w:r>
+    </w:p>
+    <w:p>
+      <w:pPr>
+        <w:spacing w:after="40" w:before="40"/>
+        <w:ind w:left="360" w:right="360"/>
+      </w:pPr>
+      <w:r>
+        <w:rPr>
+          <w:rFonts w:ascii="Courier New" w:cs="Courier New" w:eastAsia="Courier New" w:hAnsi="Courier New"/>
+          <w:color w:val="1E293B"/>
+          <w:sz w:val="18"/>
+          <w:szCs w:val="18"/>
+        </w:rPr>
+        <w:t xml:space="preserve"/>
+      </w:r>
+    </w:p>
+    <w:p>
+      <w:pPr>
+        <w:spacing w:after="40" w:before="40"/>
+        <w:ind w:left="360" w:right="360"/>
+      </w:pPr>
+      <w:r>
+        <w:rPr>
+          <w:rFonts w:ascii="Courier New" w:cs="Courier New" w:eastAsia="Courier New" w:hAnsi="Courier New"/>
+          <w:color w:val="1E293B"/>
+          <w:sz w:val="18"/>
+          <w:szCs w:val="18"/>
+        </w:rPr>
+        <w:t xml:space="preserve">router.get("/stats",                   asyncHandler(getStatsController));</w:t>
+      </w:r>
+    </w:p>
+    <w:p>
+      <w:pPr>
+        <w:spacing w:after="40" w:before="40"/>
+        <w:ind w:left="360" w:right="360"/>
+      </w:pPr>
+      <w:r>
+        <w:rPr>
+          <w:rFonts w:ascii="Courier New" w:cs="Courier New" w:eastAsia="Courier New" w:hAnsi="Courier New"/>
+          <w:color w:val="1E293B"/>
+          <w:sz w:val="18"/>
+          <w:szCs w:val="18"/>
+        </w:rPr>
+        <w:t xml:space="preserve">router.get("/users",                   asyncHandler(listUsersController));</w:t>
+      </w:r>
+    </w:p>
+    <w:p>
+      <w:pPr>
+        <w:spacing w:after="40" w:before="40"/>
+        <w:ind w:left="360" w:right="360"/>
+      </w:pPr>
+      <w:r>
+        <w:rPr>
+          <w:rFonts w:ascii="Courier New" w:cs="Courier New" w:eastAsia="Courier New" w:hAnsi="Courier New"/>
+          <w:color w:val="1E293B"/>
+          <w:sz w:val="18"/>
+          <w:szCs w:val="18"/>
+        </w:rPr>
+        <w:t xml:space="preserve">router.patch("/users/:id/role",        asyncHandler(changeUserRoleController));</w:t>
+      </w:r>
+    </w:p>
+    <w:p>
+      <w:pPr>
+        <w:spacing w:after="40" w:before="40"/>
+        <w:ind w:left="360" w:right="360"/>
+      </w:pPr>
+      <w:r>
+        <w:rPr>
+          <w:rFonts w:ascii="Courier New" w:cs="Courier New" w:eastAsia="Courier New" w:hAnsi="Courier New"/>
+          <w:color w:val="1E293B"/>
+          <w:sz w:val="18"/>
+          <w:szCs w:val="18"/>
+        </w:rPr>
+        <w:t xml:space="preserve">router.patch("/users/:id/suspend",     asyncHandler(suspendUserController));</w:t>
+      </w:r>
+    </w:p>
+    <w:p>
+      <w:pPr>
+        <w:spacing w:after="40" w:before="40"/>
+        <w:ind w:left="360" w:right="360"/>
+      </w:pPr>
+      <w:r>
+        <w:rPr>
+          <w:rFonts w:ascii="Courier New" w:cs="Courier New" w:eastAsia="Courier New" w:hAnsi="Courier New"/>
+          <w:color w:val="1E293B"/>
+          <w:sz w:val="18"/>
+          <w:szCs w:val="18"/>
+        </w:rPr>
+        <w:t xml:space="preserve">router.delete("/reviews/:reviewId",    asyncHandler(deleteReviewController));</w:t>
+      </w:r>
+    </w:p>
+    <w:p>
+      <w:pPr>
+        <w:spacing w:after="40" w:before="40"/>
+        <w:ind w:left="360" w:right="360"/>
+      </w:pPr>
+      <w:r>
+        <w:rPr>
+          <w:rFonts w:ascii="Courier New" w:cs="Courier New" w:eastAsia="Courier New" w:hAnsi="Courier New"/>
+          <w:color w:val="1E293B"/>
+          <w:sz w:val="18"/>
+          <w:szCs w:val="18"/>
+        </w:rPr>
+        <w:t xml:space="preserve">router.delete("/group-messages/:id",   asyncHandler(deleteGroupMessageController));</w:t>
+      </w:r>
+    </w:p>
+    <w:p/>
+    <w:p>
+      <w:pPr>
+        <w:spacing w:after="200"/>
+      </w:pPr>
+      <w:r>
+        <w:rPr>
+          <w:i/>
+          <w:iCs/>
+          <w:color w:val="6B7280"/>
+          <w:sz w:val="22"/>
+          <w:szCs w:val="22"/>
+        </w:rPr>
+        <w:t xml:space="preserve">Résultat : un utilisateur avec role = "USER" qui tente d'accéder à /api/admin/stats reçoit une réponse 403 Forbidden. Le rôle est encodé dans le JWT signé côté serveur — il ne peut pas être falsifié côté client.</w:t>
+      </w:r>
+    </w:p>
+    <w:p>
+      <w:pPr>
+        <w:pStyle w:val="Heading3"/>
+        <w:spacing w:after="100" w:before="200"/>
+      </w:pPr>
+      <w:r>
+        <w:t xml:space="preserve">Synthèse des couches de sécurité</w:t>
+      </w:r>
+    </w:p>
+    <w:p>
+      <w:pPr>
+        <w:spacing w:after="100"/>
+      </w:pPr>
+      <w:r>
+        <w:rPr>
+          <w:sz w:val="22"/>
+          <w:szCs w:val="22"/>
+        </w:rPr>
+        <w:t xml:space="preserve">Chaque requête entrante traverse successivement :</w:t>
+      </w:r>
+    </w:p>
+    <w:p>
+      <w:pPr>
+        <w:pStyle w:val="ListParagraph"/>
+        <w:numPr>
+          <w:ilvl w:val="0"/>
+          <w:numId w:val="1"/>
+        </w:numPr>
+        <w:spacing w:after="80"/>
+      </w:pPr>
+      <w:r>
+        <w:t xml:space="preserve">Helmet → headers HTTP défensifs (XSS, clickjacking, MIME sniffing)</w:t>
+      </w:r>
+    </w:p>
+    <w:p>
+      <w:pPr>
+        <w:pStyle w:val="ListParagraph"/>
+        <w:numPr>
+          <w:ilvl w:val="0"/>
+          <w:numId w:val="1"/>
+        </w:numPr>
+        <w:spacing w:after="80"/>
+      </w:pPr>
+      <w:r>
+        <w:t xml:space="preserve">Rate Limiter → blocage si &gt; 100 req / 15 min / IP</w:t>
+      </w:r>
+    </w:p>
+    <w:p>
+      <w:pPr>
+        <w:pStyle w:val="ListParagraph"/>
+        <w:numPr>
+          <w:ilvl w:val="0"/>
+          <w:numId w:val="1"/>
+        </w:numPr>
+        <w:spacing w:after="80"/>
+      </w:pPr>
+      <w:r>
+        <w:t xml:space="preserve">Payload limit → rejet si body &gt; 10 ko</w:t>
+      </w:r>
+    </w:p>
+    <w:p>
+      <w:pPr>
+        <w:pStyle w:val="ListParagraph"/>
+        <w:numPr>
+          <w:ilvl w:val="0"/>
+          <w:numId w:val="1"/>
+        </w:numPr>
+        <w:spacing w:after="80"/>
+      </w:pPr>
+      <w:r>
+        <w:t xml:space="preserve">sanitizeBody → échappement HTML de toutes les chaînes</w:t>
+      </w:r>
+    </w:p>
+    <w:p>
+      <w:pPr>
+        <w:pStyle w:val="ListParagraph"/>
+        <w:numPr>
+          <w:ilvl w:val="0"/>
+          <w:numId w:val="1"/>
+        </w:numPr>
+        <w:spacing w:after="80"/>
+      </w:pPr>
+      <w:r>
+        <w:t xml:space="preserve">Zod → validation typée et contraintes métier (format, longueur, enum)</w:t>
+      </w:r>
+    </w:p>
+    <w:p>
+      <w:pPr>
+        <w:pStyle w:val="ListParagraph"/>
+        <w:numPr>
+          <w:ilvl w:val="0"/>
+          <w:numId w:val="1"/>
+        </w:numPr>
+        <w:spacing w:after="80"/>
+      </w:pPr>
+      <w:r>
+        <w:t xml:space="preserve">authenticate → vérification JWT + blacklist Redis</w:t>
+      </w:r>
+    </w:p>
+    <w:p>
+      <w:pPr>
+        <w:pStyle w:val="ListParagraph"/>
+        <w:numPr>
+          <w:ilvl w:val="0"/>
+          <w:numId w:val="1"/>
+        </w:numPr>
+        <w:spacing w:after="80"/>
+      </w:pPr>
+      <w:r>
+        <w:t xml:space="preserve">requireRole → vérification du rôle (admin, modérateur...)</w:t>
+      </w:r>
+    </w:p>
+    <w:p>
+      <w:pPr>
+        <w:pStyle w:val="ListParagraph"/>
+        <w:numPr>
+          <w:ilvl w:val="0"/>
+          <w:numId w:val="1"/>
+        </w:numPr>
+        <w:spacing w:after="80"/>
+      </w:pPr>
+      <w:r>
+        <w:t xml:space="preserve">Sequelize → requêtes paramétrées → immunité injection SQL</w:t>
+      </w:r>
+    </w:p>
+    <w:p>
+      <w:pPr>
+        <w:pStyle w:val="ListParagraph"/>
+        <w:numPr>
+          <w:ilvl w:val="0"/>
+          <w:numId w:val="1"/>
+        </w:numPr>
+        <w:spacing w:after="80"/>
+      </w:pPr>
+      <w:r>
+        <w:t xml:space="preserve">UUID → clés primaires non-prédictibles → pas d'énumération</w:t>
       </w:r>
     </w:p>
     <w:p/>

</xml_diff>